<commit_message>
changed from the deployments to jobs
</commit_message>
<xml_diff>
--- a/document/killer coda.docx
+++ b/document/killer coda.docx
@@ -31,7 +31,15 @@
       </w:r>
       <w:proofErr w:type="spellEnd"/>
       <w:r>
-        <w:t xml:space="preserve"> -p ~/k8s-playwright-basic-setup/{tests,k8s}</w:t>
+        <w:t xml:space="preserve"> -p ~/k8s-playwright-basic-setup/{</w:t>
+      </w:r>
+      <w:proofErr w:type="gramStart"/>
+      <w:r>
+        <w:t>tests,k</w:t>
+      </w:r>
+      <w:proofErr w:type="gramEnd"/>
+      <w:r>
+        <w:t>8s}</w:t>
       </w:r>
     </w:p>
     <w:p>
@@ -149,15 +157,7 @@
       </w:r>
       <w:proofErr w:type="spellEnd"/>
       <w:r>
-        <w:t xml:space="preserve"> </w:t>
-      </w:r>
-      <w:proofErr w:type="spellStart"/>
-      <w:r>
-        <w:t>init</w:t>
-      </w:r>
-      <w:proofErr w:type="spellEnd"/>
-      <w:r>
-        <w:t xml:space="preserve"> -y</w:t>
+        <w:t xml:space="preserve"> init -y</w:t>
       </w:r>
     </w:p>
     <w:p>
@@ -424,13 +424,18 @@
       <w:proofErr w:type="spellEnd"/>
       <w:r>
         <w:br/>
-        <w:t xml:space="preserve">import { </w:t>
+        <w:t xml:space="preserve">import </w:t>
+      </w:r>
+      <w:proofErr w:type="gramStart"/>
+      <w:r>
+        <w:t xml:space="preserve">{ </w:t>
       </w:r>
       <w:proofErr w:type="spellStart"/>
       <w:r>
         <w:t>defineConfig</w:t>
       </w:r>
       <w:proofErr w:type="spellEnd"/>
+      <w:proofErr w:type="gramEnd"/>
       <w:r>
         <w:t xml:space="preserve"> } from '@playwright/test';</w:t>
       </w:r>
@@ -581,7 +586,15 @@
     </w:p>
     <w:p>
       <w:r>
-        <w:t>import { test, expect } from '@playwright/test';</w:t>
+        <w:t xml:space="preserve">import </w:t>
+      </w:r>
+      <w:proofErr w:type="gramStart"/>
+      <w:r>
+        <w:t>{ test</w:t>
+      </w:r>
+      <w:proofErr w:type="gramEnd"/>
+      <w:r>
+        <w:t>, expect } from '@playwright/test';</w:t>
       </w:r>
     </w:p>
     <w:p/>
@@ -592,8 +605,13 @@
     </w:p>
     <w:p>
       <w:proofErr w:type="spellStart"/>
-      <w:r>
-        <w:t>process.env.BASE_URL</w:t>
+      <w:proofErr w:type="gramStart"/>
+      <w:r>
+        <w:t>process.env.BASE</w:t>
+      </w:r>
+      <w:proofErr w:type="gramEnd"/>
+      <w:r>
+        <w:t>_URL</w:t>
       </w:r>
       <w:proofErr w:type="spellEnd"/>
       <w:r>
@@ -607,8 +625,13 @@
     </w:p>
     <w:p/>
     <w:p>
-      <w:r>
-        <w:t>test('Verify homepage', async ({ page }) =&gt; {</w:t>
+      <w:proofErr w:type="gramStart"/>
+      <w:r>
+        <w:t>test(</w:t>
+      </w:r>
+      <w:proofErr w:type="gramEnd"/>
+      <w:r>
+        <w:t>'Verify homepage', async ({ page }) =&gt; {</w:t>
       </w:r>
     </w:p>
     <w:p/>
@@ -617,10 +640,12 @@
         <w:t xml:space="preserve">  await </w:t>
       </w:r>
       <w:proofErr w:type="spellStart"/>
+      <w:proofErr w:type="gramStart"/>
       <w:r>
         <w:t>page.goto</w:t>
       </w:r>
       <w:proofErr w:type="spellEnd"/>
+      <w:proofErr w:type="gramEnd"/>
       <w:r>
         <w:t>(BASE_URL);</w:t>
       </w:r>
@@ -628,13 +653,18 @@
     <w:p/>
     <w:p>
       <w:r>
-        <w:t xml:space="preserve">  await expect(page).</w:t>
+        <w:t xml:space="preserve">  await expect(page</w:t>
+      </w:r>
+      <w:proofErr w:type="gramStart"/>
+      <w:r>
+        <w:t>).</w:t>
       </w:r>
       <w:proofErr w:type="spellStart"/>
       <w:r>
         <w:t>toHaveTitle</w:t>
       </w:r>
       <w:proofErr w:type="spellEnd"/>
+      <w:proofErr w:type="gramEnd"/>
       <w:r>
         <w:t>(/Playwright/);</w:t>
       </w:r>
@@ -2302,6 +2332,7 @@
         <w:t>staging-</w:t>
       </w:r>
       <w:proofErr w:type="spellStart"/>
+      <w:proofErr w:type="gramStart"/>
       <w:r>
         <w:rPr>
           <w:b/>
@@ -2311,6 +2342,7 @@
         <w:t>secret.yaml</w:t>
       </w:r>
       <w:proofErr w:type="spellEnd"/>
+      <w:proofErr w:type="gramEnd"/>
     </w:p>
     <w:p>
       <w:r>
@@ -2432,6 +2464,7 @@
         <w:t>prod-</w:t>
       </w:r>
       <w:proofErr w:type="spellStart"/>
+      <w:proofErr w:type="gramStart"/>
       <w:r>
         <w:rPr>
           <w:b/>
@@ -2443,6 +2476,7 @@
         <w:t>secret.yaml</w:t>
       </w:r>
       <w:proofErr w:type="spellEnd"/>
+      <w:proofErr w:type="gramEnd"/>
     </w:p>
     <w:p>
       <w:r>
@@ -2797,7 +2831,17 @@
           <w:szCs w:val="40"/>
         </w:rPr>
         <w:lastRenderedPageBreak/>
-        <w:t>Step 4: Create Deployments</w:t>
+        <w:t xml:space="preserve">Step 4: Create </w:t>
+      </w:r>
+      <w:r>
+        <w:rPr>
+          <w:b/>
+          <w:bCs/>
+          <w:color w:val="FF0000"/>
+          <w:sz w:val="40"/>
+          <w:szCs w:val="40"/>
+        </w:rPr>
+        <w:t>Jobs</w:t>
       </w:r>
     </w:p>
     <w:p/>
@@ -2808,9 +2852,36 @@
       </w:r>
       <w:proofErr w:type="spellEnd"/>
       <w:r>
-        <w:t xml:space="preserve"> k8s/deployments</w:t>
-      </w:r>
-    </w:p>
+        <w:t xml:space="preserve"> k8s/</w:t>
+      </w:r>
+      <w:r>
+        <w:t>jobs</w:t>
+      </w:r>
+    </w:p>
+    <w:p/>
+    <w:p/>
+    <w:p/>
+    <w:p/>
+    <w:p/>
+    <w:p/>
+    <w:p/>
+    <w:p/>
+    <w:p/>
+    <w:p/>
+    <w:p/>
+    <w:p/>
+    <w:p/>
+    <w:p/>
+    <w:p/>
+    <w:p/>
+    <w:p/>
+    <w:p/>
+    <w:p/>
+    <w:p/>
+    <w:p/>
+    <w:p/>
+    <w:p/>
+    <w:p/>
     <w:p/>
     <w:p>
       <w:pPr>
@@ -2831,16 +2902,26 @@
           <w:sz w:val="24"/>
           <w:szCs w:val="24"/>
         </w:rPr>
+        <w:lastRenderedPageBreak/>
         <w:t>dev</w:t>
       </w:r>
     </w:p>
     <w:p>
       <w:r>
-        <w:t>cat &lt;&lt;EOF &gt; k8s/deployments/dev-</w:t>
-      </w:r>
-      <w:proofErr w:type="spellStart"/>
-      <w:r>
-        <w:t>deployment.yaml</w:t>
+        <w:t>cat &lt;&lt;EOF &gt; k8s/</w:t>
+      </w:r>
+      <w:r>
+        <w:t>jobs</w:t>
+      </w:r>
+      <w:r>
+        <w:t>/dev-</w:t>
+      </w:r>
+      <w:proofErr w:type="spellStart"/>
+      <w:r>
+        <w:t>job</w:t>
+      </w:r>
+      <w:r>
+        <w:t>.yaml</w:t>
       </w:r>
       <w:proofErr w:type="spellEnd"/>
     </w:p>
@@ -2851,12 +2932,12 @@
       </w:r>
       <w:proofErr w:type="spellEnd"/>
       <w:r>
-        <w:t>: apps/v1</w:t>
-      </w:r>
-    </w:p>
-    <w:p>
-      <w:r>
-        <w:t>kind: Deployment</w:t>
+        <w:t>: batch/v1</w:t>
+      </w:r>
+    </w:p>
+    <w:p>
+      <w:r>
+        <w:t>kind: Job</w:t>
       </w:r>
     </w:p>
     <w:p/>
@@ -2867,7 +2948,7 @@
     </w:p>
     <w:p>
       <w:r>
-        <w:t xml:space="preserve">  name: nginx-deployment</w:t>
+        <w:t xml:space="preserve">  name: playwright-job</w:t>
       </w:r>
     </w:p>
     <w:p>
@@ -2883,22 +2964,113 @@
     </w:p>
     <w:p>
       <w:r>
-        <w:t xml:space="preserve">  replicas: 1</w:t>
-      </w:r>
-    </w:p>
-    <w:p/>
-    <w:p>
-      <w:r>
-        <w:t xml:space="preserve">  selector:</w:t>
-      </w:r>
-    </w:p>
-    <w:p>
-      <w:r>
-        <w:t xml:space="preserve">    </w:t>
-      </w:r>
-      <w:proofErr w:type="spellStart"/>
-      <w:r>
-        <w:t>matchLabels</w:t>
+        <w:t xml:space="preserve">  </w:t>
+      </w:r>
+      <w:proofErr w:type="spellStart"/>
+      <w:r>
+        <w:t>backoffLimit</w:t>
+      </w:r>
+      <w:proofErr w:type="spellEnd"/>
+      <w:r>
+        <w:t>: 2</w:t>
+      </w:r>
+    </w:p>
+    <w:p/>
+    <w:p>
+      <w:r>
+        <w:t xml:space="preserve">  template:</w:t>
+      </w:r>
+    </w:p>
+    <w:p>
+      <w:r>
+        <w:t xml:space="preserve">    metadata:</w:t>
+      </w:r>
+    </w:p>
+    <w:p>
+      <w:r>
+        <w:t xml:space="preserve">      labels:</w:t>
+      </w:r>
+    </w:p>
+    <w:p>
+      <w:r>
+        <w:t xml:space="preserve">        app: playwright-demo</w:t>
+      </w:r>
+    </w:p>
+    <w:p>
+      <w:r>
+        <w:t xml:space="preserve">        env: dev</w:t>
+      </w:r>
+    </w:p>
+    <w:p/>
+    <w:p>
+      <w:r>
+        <w:t xml:space="preserve">    spec:</w:t>
+      </w:r>
+    </w:p>
+    <w:p>
+      <w:r>
+        <w:t xml:space="preserve">      </w:t>
+      </w:r>
+      <w:proofErr w:type="spellStart"/>
+      <w:r>
+        <w:t>restartPolicy</w:t>
+      </w:r>
+      <w:proofErr w:type="spellEnd"/>
+      <w:r>
+        <w:t>: Never</w:t>
+      </w:r>
+    </w:p>
+    <w:p/>
+    <w:p>
+      <w:r>
+        <w:t xml:space="preserve">      containers:</w:t>
+      </w:r>
+    </w:p>
+    <w:p>
+      <w:r>
+        <w:t xml:space="preserve">        - name: playwright</w:t>
+      </w:r>
+    </w:p>
+    <w:p/>
+    <w:p>
+      <w:r>
+        <w:t xml:space="preserve">          # Replace with your own Playwright image</w:t>
+      </w:r>
+    </w:p>
+    <w:p>
+      <w:r>
+        <w:t xml:space="preserve">          image: mcr.microsoft.com/</w:t>
+      </w:r>
+      <w:proofErr w:type="gramStart"/>
+      <w:r>
+        <w:t>playwright:v</w:t>
+      </w:r>
+      <w:proofErr w:type="gramEnd"/>
+      <w:r>
+        <w:t>1.55.0-jammy</w:t>
+      </w:r>
+    </w:p>
+    <w:p>
+      <w:r>
+        <w:t xml:space="preserve">          </w:t>
+      </w:r>
+      <w:proofErr w:type="spellStart"/>
+      <w:r>
+        <w:t>imagePullPolicy</w:t>
+      </w:r>
+      <w:proofErr w:type="spellEnd"/>
+      <w:r>
+        <w:t>: Always</w:t>
+      </w:r>
+    </w:p>
+    <w:p/>
+    <w:p>
+      <w:r>
+        <w:t xml:space="preserve">          </w:t>
+      </w:r>
+      <w:proofErr w:type="spellStart"/>
+      <w:r>
+        <w:t>envFrom</w:t>
       </w:r>
       <w:proofErr w:type="spellEnd"/>
       <w:r>
@@ -2907,107 +3079,12 @@
     </w:p>
     <w:p>
       <w:r>
-        <w:t xml:space="preserve">      app: playwright-demo</w:t>
-      </w:r>
-    </w:p>
-    <w:p>
-      <w:r>
-        <w:t xml:space="preserve">      env: dev</w:t>
-      </w:r>
-    </w:p>
-    <w:p/>
-    <w:p>
-      <w:r>
-        <w:t xml:space="preserve">  template:</w:t>
-      </w:r>
-    </w:p>
-    <w:p>
-      <w:r>
-        <w:t xml:space="preserve">    metadata:</w:t>
-      </w:r>
-    </w:p>
-    <w:p>
-      <w:r>
-        <w:t xml:space="preserve">      labels:</w:t>
-      </w:r>
-    </w:p>
-    <w:p>
-      <w:r>
-        <w:t xml:space="preserve">        app: playwright-demo</w:t>
-      </w:r>
-    </w:p>
-    <w:p>
-      <w:r>
-        <w:t xml:space="preserve">        env: dev</w:t>
-      </w:r>
-    </w:p>
-    <w:p/>
-    <w:p>
-      <w:r>
-        <w:t xml:space="preserve">    spec:</w:t>
-      </w:r>
-    </w:p>
-    <w:p>
-      <w:r>
         <w:lastRenderedPageBreak/>
-        <w:t xml:space="preserve">      containers:</w:t>
-      </w:r>
-    </w:p>
-    <w:p>
-      <w:r>
-        <w:t xml:space="preserve">      - name: nginx</w:t>
-      </w:r>
-    </w:p>
-    <w:p>
-      <w:r>
-        <w:t xml:space="preserve">        image: </w:t>
-      </w:r>
-      <w:proofErr w:type="spellStart"/>
-      <w:r>
-        <w:t>nginx:latest</w:t>
-      </w:r>
-      <w:proofErr w:type="spellEnd"/>
-    </w:p>
-    <w:p>
-      <w:r>
-        <w:t xml:space="preserve">        </w:t>
-      </w:r>
-      <w:proofErr w:type="spellStart"/>
-      <w:r>
-        <w:t>imagePullPolicy</w:t>
-      </w:r>
-      <w:proofErr w:type="spellEnd"/>
-      <w:r>
-        <w:t>: Always</w:t>
-      </w:r>
-    </w:p>
-    <w:p/>
-    <w:p>
-      <w:r>
-        <w:t xml:space="preserve">        ports:</w:t>
-      </w:r>
-    </w:p>
-    <w:p>
-      <w:r>
-        <w:t xml:space="preserve">        - </w:t>
-      </w:r>
-      <w:proofErr w:type="spellStart"/>
-      <w:r>
-        <w:t>containerPort</w:t>
-      </w:r>
-      <w:proofErr w:type="spellEnd"/>
-      <w:r>
-        <w:t>: 80</w:t>
-      </w:r>
-    </w:p>
-    <w:p/>
-    <w:p>
-      <w:r>
-        <w:t xml:space="preserve">        </w:t>
-      </w:r>
-      <w:proofErr w:type="spellStart"/>
-      <w:r>
-        <w:t>envFrom</w:t>
+        <w:t xml:space="preserve">            - </w:t>
+      </w:r>
+      <w:proofErr w:type="spellStart"/>
+      <w:r>
+        <w:t>configMapRef</w:t>
       </w:r>
       <w:proofErr w:type="spellEnd"/>
       <w:r>
@@ -3016,11 +3093,17 @@
     </w:p>
     <w:p>
       <w:r>
-        <w:t xml:space="preserve">        - </w:t>
-      </w:r>
-      <w:proofErr w:type="spellStart"/>
-      <w:r>
-        <w:t>configMapRef</w:t>
+        <w:t xml:space="preserve">                name: nginx-config</w:t>
+      </w:r>
+    </w:p>
+    <w:p/>
+    <w:p>
+      <w:r>
+        <w:t xml:space="preserve">            - </w:t>
+      </w:r>
+      <w:proofErr w:type="spellStart"/>
+      <w:r>
+        <w:t>secretRef</w:t>
       </w:r>
       <w:proofErr w:type="spellEnd"/>
       <w:r>
@@ -3029,17 +3112,52 @@
     </w:p>
     <w:p>
       <w:r>
-        <w:t xml:space="preserve">            name: nginx-config</w:t>
-      </w:r>
-    </w:p>
-    <w:p/>
-    <w:p>
-      <w:r>
-        <w:t xml:space="preserve">        - </w:t>
-      </w:r>
-      <w:proofErr w:type="spellStart"/>
-      <w:r>
-        <w:t>secretRef</w:t>
+        <w:t xml:space="preserve">                name: nginx-secret</w:t>
+      </w:r>
+    </w:p>
+    <w:p/>
+    <w:p>
+      <w:r>
+        <w:t xml:space="preserve">          </w:t>
+      </w:r>
+      <w:proofErr w:type="spellStart"/>
+      <w:r>
+        <w:t>workingDir</w:t>
+      </w:r>
+      <w:proofErr w:type="spellEnd"/>
+      <w:r>
+        <w:t>: /app</w:t>
+      </w:r>
+    </w:p>
+    <w:p/>
+    <w:p>
+      <w:r>
+        <w:t xml:space="preserve">          command:</w:t>
+      </w:r>
+    </w:p>
+    <w:p>
+      <w:r>
+        <w:t xml:space="preserve">            - </w:t>
+      </w:r>
+      <w:proofErr w:type="spellStart"/>
+      <w:r>
+        <w:t>sh</w:t>
+      </w:r>
+      <w:proofErr w:type="spellEnd"/>
+    </w:p>
+    <w:p>
+      <w:r>
+        <w:t xml:space="preserve">            - -c</w:t>
+      </w:r>
+    </w:p>
+    <w:p/>
+    <w:p>
+      <w:r>
+        <w:t xml:space="preserve">          </w:t>
+      </w:r>
+      <w:proofErr w:type="spellStart"/>
+      <w:r>
+        <w:t>args</w:t>
       </w:r>
       <w:proofErr w:type="spellEnd"/>
       <w:r>
@@ -3048,7 +3166,46 @@
     </w:p>
     <w:p>
       <w:r>
-        <w:t xml:space="preserve">            name: nginx-secret</w:t>
+        <w:t xml:space="preserve">            - |</w:t>
+      </w:r>
+    </w:p>
+    <w:p>
+      <w:r>
+        <w:t xml:space="preserve">              echo "Starting Playwright Tests..."</w:t>
+      </w:r>
+    </w:p>
+    <w:p/>
+    <w:p>
+      <w:r>
+        <w:t xml:space="preserve">              </w:t>
+      </w:r>
+      <w:proofErr w:type="spellStart"/>
+      <w:r>
+        <w:t>npm</w:t>
+      </w:r>
+      <w:proofErr w:type="spellEnd"/>
+      <w:r>
+        <w:t xml:space="preserve"> ci</w:t>
+      </w:r>
+    </w:p>
+    <w:p/>
+    <w:p>
+      <w:r>
+        <w:t xml:space="preserve">              </w:t>
+      </w:r>
+      <w:proofErr w:type="spellStart"/>
+      <w:r>
+        <w:t>npx</w:t>
+      </w:r>
+      <w:proofErr w:type="spellEnd"/>
+      <w:r>
+        <w:t xml:space="preserve"> playwright test</w:t>
+      </w:r>
+    </w:p>
+    <w:p/>
+    <w:p>
+      <w:r>
+        <w:t xml:space="preserve">              echo "Playwright Tests Completed."</w:t>
       </w:r>
     </w:p>
     <w:p>
@@ -3056,6 +3213,11 @@
         <w:t>EOF</w:t>
       </w:r>
     </w:p>
+    <w:p/>
+    <w:p/>
+    <w:p/>
+    <w:p/>
+    <w:p/>
     <w:p/>
     <w:p/>
     <w:p>
@@ -3077,17 +3239,18 @@
           <w:sz w:val="24"/>
           <w:szCs w:val="24"/>
         </w:rPr>
+        <w:lastRenderedPageBreak/>
         <w:t>staging</w:t>
       </w:r>
     </w:p>
     <w:p/>
     <w:p>
       <w:r>
-        <w:t>cat &lt;&lt;EOF &gt; k8s/deployments/staging-</w:t>
-      </w:r>
-      <w:proofErr w:type="spellStart"/>
-      <w:r>
-        <w:t>deployment.yaml</w:t>
+        <w:t>cat &lt;&lt;EOF &gt; k8s/jobs/staging-</w:t>
+      </w:r>
+      <w:proofErr w:type="spellStart"/>
+      <w:r>
+        <w:t>job.yaml</w:t>
       </w:r>
       <w:proofErr w:type="spellEnd"/>
     </w:p>
@@ -3098,12 +3261,12 @@
       </w:r>
       <w:proofErr w:type="spellEnd"/>
       <w:r>
-        <w:t>: apps/v1</w:t>
-      </w:r>
-    </w:p>
-    <w:p>
-      <w:r>
-        <w:t>kind: Deployment</w:t>
+        <w:t>: batch/v1</w:t>
+      </w:r>
+    </w:p>
+    <w:p>
+      <w:r>
+        <w:t>kind: Job</w:t>
       </w:r>
     </w:p>
     <w:p/>
@@ -3114,7 +3277,7 @@
     </w:p>
     <w:p>
       <w:r>
-        <w:t xml:space="preserve">  name: nginx-deployment</w:t>
+        <w:t xml:space="preserve">  name: playwright-job</w:t>
       </w:r>
     </w:p>
     <w:p>
@@ -3130,22 +3293,80 @@
     </w:p>
     <w:p>
       <w:r>
-        <w:t xml:space="preserve">  replicas: 1</w:t>
-      </w:r>
-    </w:p>
-    <w:p/>
-    <w:p>
-      <w:r>
-        <w:t xml:space="preserve">  selector:</w:t>
-      </w:r>
-    </w:p>
-    <w:p>
-      <w:r>
-        <w:t xml:space="preserve">    </w:t>
-      </w:r>
-      <w:proofErr w:type="spellStart"/>
-      <w:r>
-        <w:t>matchLabels</w:t>
+        <w:t xml:space="preserve">  </w:t>
+      </w:r>
+      <w:proofErr w:type="spellStart"/>
+      <w:r>
+        <w:t>backoffLimit</w:t>
+      </w:r>
+      <w:proofErr w:type="spellEnd"/>
+      <w:r>
+        <w:t>: 2</w:t>
+      </w:r>
+    </w:p>
+    <w:p/>
+    <w:p>
+      <w:r>
+        <w:t xml:space="preserve">  template:</w:t>
+      </w:r>
+    </w:p>
+    <w:p>
+      <w:r>
+        <w:t xml:space="preserve">    metadata:</w:t>
+      </w:r>
+    </w:p>
+    <w:p>
+      <w:r>
+        <w:t xml:space="preserve">      labels:</w:t>
+      </w:r>
+    </w:p>
+    <w:p>
+      <w:r>
+        <w:t xml:space="preserve">        app: playwright-demo</w:t>
+      </w:r>
+    </w:p>
+    <w:p>
+      <w:r>
+        <w:t xml:space="preserve">        env: staging</w:t>
+      </w:r>
+    </w:p>
+    <w:p/>
+    <w:p>
+      <w:r>
+        <w:t xml:space="preserve">    spec:</w:t>
+      </w:r>
+    </w:p>
+    <w:p>
+      <w:r>
+        <w:t xml:space="preserve">      </w:t>
+      </w:r>
+      <w:proofErr w:type="spellStart"/>
+      <w:r>
+        <w:t>restartPolicy</w:t>
+      </w:r>
+      <w:proofErr w:type="spellEnd"/>
+      <w:r>
+        <w:t>: Never</w:t>
+      </w:r>
+    </w:p>
+    <w:p/>
+    <w:p>
+      <w:r>
+        <w:t xml:space="preserve">      volumes:</w:t>
+      </w:r>
+    </w:p>
+    <w:p>
+      <w:r>
+        <w:t xml:space="preserve">      - name: playwright-project</w:t>
+      </w:r>
+    </w:p>
+    <w:p>
+      <w:r>
+        <w:t xml:space="preserve">        </w:t>
+      </w:r>
+      <w:proofErr w:type="spellStart"/>
+      <w:r>
+        <w:t>hostPath</w:t>
       </w:r>
       <w:proofErr w:type="spellEnd"/>
       <w:r>
@@ -3154,46 +3375,15 @@
     </w:p>
     <w:p>
       <w:r>
-        <w:t xml:space="preserve">      app: playwright-demo</w:t>
-      </w:r>
-    </w:p>
-    <w:p>
-      <w:r>
-        <w:t xml:space="preserve">      env: staging</w:t>
-      </w:r>
-    </w:p>
-    <w:p/>
-    <w:p>
-      <w:r>
-        <w:t xml:space="preserve">  template:</w:t>
-      </w:r>
-    </w:p>
-    <w:p>
-      <w:r>
-        <w:t xml:space="preserve">    metadata:</w:t>
-      </w:r>
-    </w:p>
-    <w:p>
-      <w:r>
-        <w:t xml:space="preserve">      labels:</w:t>
-      </w:r>
-    </w:p>
-    <w:p>
-      <w:r>
-        <w:t xml:space="preserve">        app: playwright-demo</w:t>
-      </w:r>
-    </w:p>
-    <w:p>
-      <w:r>
-        <w:t xml:space="preserve">        env: staging</w:t>
-      </w:r>
-    </w:p>
-    <w:p/>
-    <w:p>
-      <w:r>
-        <w:t xml:space="preserve">    spec:</w:t>
-      </w:r>
-    </w:p>
+        <w:t xml:space="preserve">          path: /root/k8s-playwright-basic-setup</w:t>
+      </w:r>
+    </w:p>
+    <w:p>
+      <w:r>
+        <w:t xml:space="preserve">          type: Directory</w:t>
+      </w:r>
+    </w:p>
+    <w:p/>
     <w:p>
       <w:r>
         <w:t xml:space="preserve">      containers:</w:t>
@@ -3201,18 +3391,23 @@
     </w:p>
     <w:p>
       <w:r>
-        <w:t xml:space="preserve">      - name: nginx</w:t>
-      </w:r>
-    </w:p>
-    <w:p>
-      <w:r>
-        <w:t xml:space="preserve">        image: </w:t>
-      </w:r>
-      <w:proofErr w:type="spellStart"/>
-      <w:r>
-        <w:t>nginx:latest</w:t>
-      </w:r>
-      <w:proofErr w:type="spellEnd"/>
+        <w:lastRenderedPageBreak/>
+        <w:t xml:space="preserve">      - name: playwright</w:t>
+      </w:r>
+    </w:p>
+    <w:p/>
+    <w:p>
+      <w:r>
+        <w:t xml:space="preserve">        image: mcr.microsoft.com/</w:t>
+      </w:r>
+      <w:proofErr w:type="gramStart"/>
+      <w:r>
+        <w:t>playwright:v</w:t>
+      </w:r>
+      <w:proofErr w:type="gramEnd"/>
+      <w:r>
+        <w:t>1.55.0-jammy</w:t>
+      </w:r>
     </w:p>
     <w:p>
       <w:r>
@@ -3230,7 +3425,61 @@
     <w:p/>
     <w:p>
       <w:r>
-        <w:t xml:space="preserve">        ports:</w:t>
+        <w:t xml:space="preserve">        </w:t>
+      </w:r>
+      <w:proofErr w:type="spellStart"/>
+      <w:r>
+        <w:t>workingDir</w:t>
+      </w:r>
+      <w:proofErr w:type="spellEnd"/>
+      <w:r>
+        <w:t>: /app</w:t>
+      </w:r>
+    </w:p>
+    <w:p/>
+    <w:p>
+      <w:r>
+        <w:t xml:space="preserve">        </w:t>
+      </w:r>
+      <w:proofErr w:type="spellStart"/>
+      <w:r>
+        <w:t>volumeMounts</w:t>
+      </w:r>
+      <w:proofErr w:type="spellEnd"/>
+      <w:r>
+        <w:t>:</w:t>
+      </w:r>
+    </w:p>
+    <w:p>
+      <w:r>
+        <w:t xml:space="preserve">        - name: playwright-project</w:t>
+      </w:r>
+    </w:p>
+    <w:p>
+      <w:r>
+        <w:t xml:space="preserve">          </w:t>
+      </w:r>
+      <w:proofErr w:type="spellStart"/>
+      <w:r>
+        <w:t>mountPath</w:t>
+      </w:r>
+      <w:proofErr w:type="spellEnd"/>
+      <w:r>
+        <w:t>: /app</w:t>
+      </w:r>
+    </w:p>
+    <w:p/>
+    <w:p>
+      <w:r>
+        <w:t xml:space="preserve">        </w:t>
+      </w:r>
+      <w:proofErr w:type="spellStart"/>
+      <w:r>
+        <w:t>envFrom</w:t>
+      </w:r>
+      <w:proofErr w:type="spellEnd"/>
+      <w:r>
+        <w:t>:</w:t>
       </w:r>
     </w:p>
     <w:p>
@@ -3239,11 +3488,55 @@
       </w:r>
       <w:proofErr w:type="spellStart"/>
       <w:r>
-        <w:t>containerPort</w:t>
-      </w:r>
-      <w:proofErr w:type="spellEnd"/>
-      <w:r>
-        <w:t>: 80</w:t>
+        <w:t>configMapRef</w:t>
+      </w:r>
+      <w:proofErr w:type="spellEnd"/>
+      <w:r>
+        <w:t>:</w:t>
+      </w:r>
+    </w:p>
+    <w:p>
+      <w:r>
+        <w:t xml:space="preserve">            name: nginx-config</w:t>
+      </w:r>
+    </w:p>
+    <w:p>
+      <w:r>
+        <w:t xml:space="preserve">        - </w:t>
+      </w:r>
+      <w:proofErr w:type="spellStart"/>
+      <w:r>
+        <w:t>secretRef</w:t>
+      </w:r>
+      <w:proofErr w:type="spellEnd"/>
+      <w:r>
+        <w:t>:</w:t>
+      </w:r>
+    </w:p>
+    <w:p>
+      <w:r>
+        <w:t xml:space="preserve">            name: nginx-secret</w:t>
+      </w:r>
+    </w:p>
+    <w:p/>
+    <w:p>
+      <w:r>
+        <w:t xml:space="preserve">        command:</w:t>
+      </w:r>
+    </w:p>
+    <w:p>
+      <w:r>
+        <w:t xml:space="preserve">        - </w:t>
+      </w:r>
+      <w:proofErr w:type="spellStart"/>
+      <w:r>
+        <w:t>sh</w:t>
+      </w:r>
+      <w:proofErr w:type="spellEnd"/>
+    </w:p>
+    <w:p>
+      <w:r>
+        <w:t xml:space="preserve">        - -c</w:t>
       </w:r>
     </w:p>
     <w:p/>
@@ -3253,7 +3546,7 @@
       </w:r>
       <w:proofErr w:type="spellStart"/>
       <w:r>
-        <w:t>envFrom</w:t>
+        <w:t>args</w:t>
       </w:r>
       <w:proofErr w:type="spellEnd"/>
       <w:r>
@@ -3262,39 +3555,48 @@
     </w:p>
     <w:p>
       <w:r>
-        <w:t xml:space="preserve">        - </w:t>
-      </w:r>
-      <w:proofErr w:type="spellStart"/>
-      <w:r>
-        <w:t>configMapRef</w:t>
-      </w:r>
-      <w:proofErr w:type="spellEnd"/>
-      <w:r>
-        <w:t>:</w:t>
-      </w:r>
-    </w:p>
-    <w:p>
-      <w:r>
-        <w:t xml:space="preserve">            name: nginx-config</w:t>
-      </w:r>
-    </w:p>
-    <w:p/>
-    <w:p>
-      <w:r>
-        <w:t xml:space="preserve">        - </w:t>
-      </w:r>
-      <w:proofErr w:type="spellStart"/>
-      <w:r>
-        <w:t>secretRef</w:t>
-      </w:r>
-      <w:proofErr w:type="spellEnd"/>
-      <w:r>
-        <w:t>:</w:t>
-      </w:r>
-    </w:p>
-    <w:p>
-      <w:r>
-        <w:t xml:space="preserve">            name: nginx-secret</w:t>
+        <w:t xml:space="preserve">        - |</w:t>
+      </w:r>
+    </w:p>
+    <w:p>
+      <w:r>
+        <w:t xml:space="preserve">          </w:t>
+      </w:r>
+      <w:proofErr w:type="spellStart"/>
+      <w:r>
+        <w:t>pwd</w:t>
+      </w:r>
+      <w:proofErr w:type="spellEnd"/>
+    </w:p>
+    <w:p>
+      <w:r>
+        <w:t xml:space="preserve">          ls -la</w:t>
+      </w:r>
+    </w:p>
+    <w:p>
+      <w:r>
+        <w:t xml:space="preserve">          </w:t>
+      </w:r>
+      <w:proofErr w:type="spellStart"/>
+      <w:r>
+        <w:t>npm</w:t>
+      </w:r>
+      <w:proofErr w:type="spellEnd"/>
+      <w:r>
+        <w:t xml:space="preserve"> ci</w:t>
+      </w:r>
+    </w:p>
+    <w:p>
+      <w:r>
+        <w:t xml:space="preserve">          </w:t>
+      </w:r>
+      <w:proofErr w:type="spellStart"/>
+      <w:r>
+        <w:t>npx</w:t>
+      </w:r>
+      <w:proofErr w:type="spellEnd"/>
+      <w:r>
+        <w:t xml:space="preserve"> playwright test</w:t>
       </w:r>
     </w:p>
     <w:p>
@@ -3302,6 +3604,7 @@
         <w:t>EOF</w:t>
       </w:r>
     </w:p>
+    <w:p/>
     <w:p/>
     <w:p>
       <w:pPr>
@@ -3322,77 +3625,192 @@
           <w:sz w:val="24"/>
           <w:szCs w:val="24"/>
         </w:rPr>
+        <w:t>prod</w:t>
+      </w:r>
+    </w:p>
+    <w:p>
+      <w:r>
+        <w:t>cat &lt;&lt;EOF &gt; k8s/jobs/prod-</w:t>
+      </w:r>
+      <w:proofErr w:type="spellStart"/>
+      <w:r>
+        <w:t>job.yaml</w:t>
+      </w:r>
+      <w:proofErr w:type="spellEnd"/>
+    </w:p>
+    <w:p>
+      <w:proofErr w:type="spellStart"/>
+      <w:r>
+        <w:t>apiVersion</w:t>
+      </w:r>
+      <w:proofErr w:type="spellEnd"/>
+      <w:r>
+        <w:t>: batch/v1</w:t>
+      </w:r>
+    </w:p>
+    <w:p>
+      <w:r>
+        <w:t>kind: Job</w:t>
+      </w:r>
+    </w:p>
+    <w:p/>
+    <w:p>
+      <w:r>
+        <w:t>metadata:</w:t>
+      </w:r>
+    </w:p>
+    <w:p>
+      <w:r>
+        <w:t xml:space="preserve">  name: playwright-job</w:t>
+      </w:r>
+    </w:p>
+    <w:p>
+      <w:r>
+        <w:t xml:space="preserve">  namespace: prod</w:t>
+      </w:r>
+    </w:p>
+    <w:p/>
+    <w:p>
+      <w:r>
+        <w:t>spec:</w:t>
+      </w:r>
+    </w:p>
+    <w:p>
+      <w:r>
+        <w:t xml:space="preserve">  </w:t>
+      </w:r>
+      <w:proofErr w:type="spellStart"/>
+      <w:r>
+        <w:t>backoffLimit</w:t>
+      </w:r>
+      <w:proofErr w:type="spellEnd"/>
+      <w:r>
+        <w:t>: 2</w:t>
+      </w:r>
+    </w:p>
+    <w:p/>
+    <w:p>
+      <w:r>
+        <w:t xml:space="preserve">  template:</w:t>
+      </w:r>
+    </w:p>
+    <w:p>
+      <w:r>
+        <w:t xml:space="preserve">    metadata:</w:t>
+      </w:r>
+    </w:p>
+    <w:p>
+      <w:r>
+        <w:t xml:space="preserve">      labels:</w:t>
+      </w:r>
+    </w:p>
+    <w:p>
+      <w:r>
+        <w:t xml:space="preserve">        app: playwright-demo</w:t>
+      </w:r>
+    </w:p>
+    <w:p>
+      <w:r>
+        <w:t xml:space="preserve">        env: prod</w:t>
+      </w:r>
+    </w:p>
+    <w:p/>
+    <w:p>
+      <w:r>
+        <w:t xml:space="preserve">    spec:</w:t>
+      </w:r>
+    </w:p>
+    <w:p>
+      <w:r>
+        <w:t xml:space="preserve">      </w:t>
+      </w:r>
+      <w:proofErr w:type="spellStart"/>
+      <w:r>
+        <w:t>restartPolicy</w:t>
+      </w:r>
+      <w:proofErr w:type="spellEnd"/>
+      <w:r>
+        <w:t>: Never</w:t>
+      </w:r>
+    </w:p>
+    <w:p/>
+    <w:p>
+      <w:r>
+        <w:t xml:space="preserve">      containers:</w:t>
+      </w:r>
+    </w:p>
+    <w:p>
+      <w:r>
+        <w:t xml:space="preserve">      - name: playwright</w:t>
+      </w:r>
+    </w:p>
+    <w:p>
+      <w:r>
+        <w:t xml:space="preserve">        image: mcr.microsoft.com/</w:t>
+      </w:r>
+      <w:proofErr w:type="gramStart"/>
+      <w:r>
+        <w:t>playwright:v</w:t>
+      </w:r>
+      <w:proofErr w:type="gramEnd"/>
+      <w:r>
+        <w:t>1.55.0-jammy</w:t>
+      </w:r>
+    </w:p>
+    <w:p>
+      <w:r>
+        <w:t xml:space="preserve">        </w:t>
+      </w:r>
+      <w:proofErr w:type="spellStart"/>
+      <w:r>
+        <w:t>imagePullPolicy</w:t>
+      </w:r>
+      <w:proofErr w:type="spellEnd"/>
+      <w:r>
+        <w:t>: Always</w:t>
+      </w:r>
+    </w:p>
+    <w:p/>
+    <w:p>
+      <w:r>
+        <w:t xml:space="preserve">        </w:t>
+      </w:r>
+      <w:proofErr w:type="spellStart"/>
+      <w:r>
+        <w:t>envFrom</w:t>
+      </w:r>
+      <w:proofErr w:type="spellEnd"/>
+      <w:r>
+        <w:t>:</w:t>
+      </w:r>
+    </w:p>
+    <w:p>
+      <w:r>
+        <w:t xml:space="preserve">        - </w:t>
+      </w:r>
+      <w:proofErr w:type="spellStart"/>
+      <w:r>
+        <w:t>configMapRef</w:t>
+      </w:r>
+      <w:proofErr w:type="spellEnd"/>
+      <w:r>
+        <w:t>:</w:t>
+      </w:r>
+    </w:p>
+    <w:p>
+      <w:r>
         <w:lastRenderedPageBreak/>
-        <w:t>prod</w:t>
-      </w:r>
-    </w:p>
-    <w:p/>
-    <w:p/>
-    <w:p>
-      <w:r>
-        <w:t>cat &lt;&lt;EOF &gt; k8s/deployments/prod-</w:t>
-      </w:r>
-      <w:proofErr w:type="spellStart"/>
-      <w:r>
-        <w:t>deployment.yaml</w:t>
-      </w:r>
-      <w:proofErr w:type="spellEnd"/>
-    </w:p>
-    <w:p>
-      <w:proofErr w:type="spellStart"/>
-      <w:r>
-        <w:t>apiVersion</w:t>
-      </w:r>
-      <w:proofErr w:type="spellEnd"/>
-      <w:r>
-        <w:t>: apps/v1</w:t>
-      </w:r>
-    </w:p>
-    <w:p>
-      <w:r>
-        <w:t>kind: Deployment</w:t>
-      </w:r>
-    </w:p>
-    <w:p/>
-    <w:p>
-      <w:r>
-        <w:t>metadata:</w:t>
-      </w:r>
-    </w:p>
-    <w:p>
-      <w:r>
-        <w:t xml:space="preserve">  name: nginx-deployment</w:t>
-      </w:r>
-    </w:p>
-    <w:p>
-      <w:r>
-        <w:t xml:space="preserve">  namespace: prod</w:t>
-      </w:r>
-    </w:p>
-    <w:p/>
-    <w:p>
-      <w:r>
-        <w:t>spec:</w:t>
-      </w:r>
-    </w:p>
-    <w:p>
-      <w:r>
-        <w:t xml:space="preserve">  replicas: 1</w:t>
-      </w:r>
-    </w:p>
-    <w:p/>
-    <w:p>
-      <w:r>
-        <w:t xml:space="preserve">  selector:</w:t>
-      </w:r>
-    </w:p>
-    <w:p>
-      <w:r>
-        <w:t xml:space="preserve">    </w:t>
-      </w:r>
-      <w:proofErr w:type="spellStart"/>
-      <w:r>
-        <w:t>matchLabels</w:t>
+        <w:t xml:space="preserve">            name: nginx-config</w:t>
+      </w:r>
+    </w:p>
+    <w:p/>
+    <w:p>
+      <w:r>
+        <w:t xml:space="preserve">        - </w:t>
+      </w:r>
+      <w:proofErr w:type="spellStart"/>
+      <w:r>
+        <w:t>secretRef</w:t>
       </w:r>
       <w:proofErr w:type="spellEnd"/>
       <w:r>
@@ -3401,107 +3819,38 @@
     </w:p>
     <w:p>
       <w:r>
-        <w:t xml:space="preserve">      app: playwright-demo</w:t>
-      </w:r>
-    </w:p>
-    <w:p>
-      <w:r>
-        <w:t xml:space="preserve">      env: prod</w:t>
-      </w:r>
-    </w:p>
-    <w:p/>
-    <w:p>
-      <w:r>
-        <w:t xml:space="preserve">  template:</w:t>
-      </w:r>
-    </w:p>
-    <w:p>
-      <w:r>
-        <w:t xml:space="preserve">    metadata:</w:t>
-      </w:r>
-    </w:p>
-    <w:p>
-      <w:r>
-        <w:t xml:space="preserve">      labels:</w:t>
-      </w:r>
-    </w:p>
-    <w:p>
-      <w:r>
-        <w:t xml:space="preserve">        app: playwright-demo</w:t>
-      </w:r>
-    </w:p>
-    <w:p>
-      <w:r>
-        <w:t xml:space="preserve">        env: prod</w:t>
-      </w:r>
-    </w:p>
-    <w:p/>
-    <w:p>
-      <w:r>
-        <w:t xml:space="preserve">    spec:</w:t>
-      </w:r>
-    </w:p>
-    <w:p>
-      <w:r>
-        <w:t xml:space="preserve">      containers:</w:t>
-      </w:r>
-    </w:p>
-    <w:p>
-      <w:r>
-        <w:t xml:space="preserve">      - name: nginx</w:t>
-      </w:r>
-    </w:p>
-    <w:p>
-      <w:r>
-        <w:t xml:space="preserve">        image: </w:t>
-      </w:r>
-      <w:proofErr w:type="spellStart"/>
-      <w:r>
-        <w:t>nginx:latest</w:t>
-      </w:r>
-      <w:proofErr w:type="spellEnd"/>
-    </w:p>
-    <w:p>
-      <w:r>
-        <w:lastRenderedPageBreak/>
+        <w:t xml:space="preserve">            name: nginx-secret</w:t>
+      </w:r>
+    </w:p>
+    <w:p/>
+    <w:p>
+      <w:r>
+        <w:t xml:space="preserve">        command:</w:t>
+      </w:r>
+    </w:p>
+    <w:p>
+      <w:r>
+        <w:t xml:space="preserve">        - </w:t>
+      </w:r>
+      <w:proofErr w:type="spellStart"/>
+      <w:r>
+        <w:t>sh</w:t>
+      </w:r>
+      <w:proofErr w:type="spellEnd"/>
+    </w:p>
+    <w:p>
+      <w:r>
+        <w:t xml:space="preserve">        - -c</w:t>
+      </w:r>
+    </w:p>
+    <w:p/>
+    <w:p>
+      <w:r>
         <w:t xml:space="preserve">        </w:t>
       </w:r>
       <w:proofErr w:type="spellStart"/>
       <w:r>
-        <w:t>imagePullPolicy</w:t>
-      </w:r>
-      <w:proofErr w:type="spellEnd"/>
-      <w:r>
-        <w:t>: Always</w:t>
-      </w:r>
-    </w:p>
-    <w:p/>
-    <w:p>
-      <w:r>
-        <w:t xml:space="preserve">        ports:</w:t>
-      </w:r>
-    </w:p>
-    <w:p>
-      <w:r>
-        <w:t xml:space="preserve">        - </w:t>
-      </w:r>
-      <w:proofErr w:type="spellStart"/>
-      <w:r>
-        <w:t>containerPort</w:t>
-      </w:r>
-      <w:proofErr w:type="spellEnd"/>
-      <w:r>
-        <w:t>: 80</w:t>
-      </w:r>
-    </w:p>
-    <w:p/>
-    <w:p>
-      <w:r>
-        <w:t xml:space="preserve">        </w:t>
-      </w:r>
-      <w:proofErr w:type="spellStart"/>
-      <w:r>
-        <w:t>envFrom</w:t>
+        <w:t>args</w:t>
       </w:r>
       <w:proofErr w:type="spellEnd"/>
       <w:r>
@@ -3510,39 +3859,46 @@
     </w:p>
     <w:p>
       <w:r>
-        <w:t xml:space="preserve">        - </w:t>
-      </w:r>
-      <w:proofErr w:type="spellStart"/>
-      <w:r>
-        <w:t>configMapRef</w:t>
-      </w:r>
-      <w:proofErr w:type="spellEnd"/>
-      <w:r>
-        <w:t>:</w:t>
-      </w:r>
-    </w:p>
-    <w:p>
-      <w:r>
-        <w:t xml:space="preserve">            name: nginx-config</w:t>
-      </w:r>
-    </w:p>
-    <w:p/>
-    <w:p>
-      <w:r>
-        <w:t xml:space="preserve">        - </w:t>
-      </w:r>
-      <w:proofErr w:type="spellStart"/>
-      <w:r>
-        <w:t>secretRef</w:t>
-      </w:r>
-      <w:proofErr w:type="spellEnd"/>
-      <w:r>
-        <w:t>:</w:t>
-      </w:r>
-    </w:p>
-    <w:p>
-      <w:r>
-        <w:t xml:space="preserve">            name: nginx-secret</w:t>
+        <w:t xml:space="preserve">        - |</w:t>
+      </w:r>
+    </w:p>
+    <w:p>
+      <w:r>
+        <w:t xml:space="preserve">          echo "Starting Playwright Tests..."</w:t>
+      </w:r>
+    </w:p>
+    <w:p/>
+    <w:p>
+      <w:r>
+        <w:t xml:space="preserve">          </w:t>
+      </w:r>
+      <w:proofErr w:type="spellStart"/>
+      <w:r>
+        <w:t>npm</w:t>
+      </w:r>
+      <w:proofErr w:type="spellEnd"/>
+      <w:r>
+        <w:t xml:space="preserve"> ci</w:t>
+      </w:r>
+    </w:p>
+    <w:p/>
+    <w:p>
+      <w:r>
+        <w:t xml:space="preserve">          </w:t>
+      </w:r>
+      <w:proofErr w:type="spellStart"/>
+      <w:r>
+        <w:t>npx</w:t>
+      </w:r>
+      <w:proofErr w:type="spellEnd"/>
+      <w:r>
+        <w:t xml:space="preserve"> playwright test</w:t>
+      </w:r>
+    </w:p>
+    <w:p/>
+    <w:p>
+      <w:r>
+        <w:t xml:space="preserve">          echo "Playwright Tests Completed."</w:t>
       </w:r>
     </w:p>
     <w:p>
@@ -3551,6 +3907,16 @@
       </w:r>
     </w:p>
     <w:p/>
+    <w:p/>
+    <w:p/>
+    <w:p/>
+    <w:p/>
+    <w:p/>
+    <w:p/>
+    <w:p/>
+    <w:p/>
+    <w:p/>
+    <w:p/>
     <w:p>
       <w:pPr>
         <w:jc w:val="center"/>
@@ -3570,17 +3936,32 @@
       </w:r>
     </w:p>
     <w:p>
+      <w:pPr>
+        <w:rPr>
+          <w:b/>
+          <w:bCs/>
+        </w:rPr>
+      </w:pPr>
+      <w:r>
+        <w:rPr>
+          <w:b/>
+          <w:bCs/>
+        </w:rPr>
+        <w:t># Create the Jobs</w:t>
+      </w:r>
+    </w:p>
+    <w:p>
       <w:proofErr w:type="spellStart"/>
       <w:r>
         <w:t>kubectl</w:t>
       </w:r>
       <w:proofErr w:type="spellEnd"/>
       <w:r>
-        <w:t xml:space="preserve"> apply -f k8s/deployments/dev-</w:t>
-      </w:r>
-      <w:proofErr w:type="spellStart"/>
-      <w:r>
-        <w:t>deployment.yaml</w:t>
+        <w:t xml:space="preserve"> apply -f k8s/jobs/dev-</w:t>
+      </w:r>
+      <w:proofErr w:type="spellStart"/>
+      <w:r>
+        <w:t>job.yaml</w:t>
       </w:r>
       <w:proofErr w:type="spellEnd"/>
     </w:p>
@@ -3591,11 +3972,11 @@
       </w:r>
       <w:proofErr w:type="spellEnd"/>
       <w:r>
-        <w:t xml:space="preserve"> apply -f k8s/deployments/staging-</w:t>
-      </w:r>
-      <w:proofErr w:type="spellStart"/>
-      <w:r>
-        <w:t>deployment.yaml</w:t>
+        <w:t xml:space="preserve"> apply -f k8s/jobs/staging-</w:t>
+      </w:r>
+      <w:proofErr w:type="spellStart"/>
+      <w:r>
+        <w:t>job.yaml</w:t>
       </w:r>
       <w:proofErr w:type="spellEnd"/>
     </w:p>
@@ -3606,171 +3987,189 @@
       </w:r>
       <w:proofErr w:type="spellEnd"/>
       <w:r>
-        <w:t xml:space="preserve"> apply -f k8s/deployments/prod-</w:t>
-      </w:r>
-      <w:proofErr w:type="spellStart"/>
-      <w:r>
-        <w:t>deployment.yaml</w:t>
-      </w:r>
-      <w:proofErr w:type="spellEnd"/>
-    </w:p>
-    <w:p>
-      <w:pPr>
-        <w:rPr>
-          <w:rStyle w:val="n"/>
-        </w:rPr>
-      </w:pPr>
+        <w:t xml:space="preserve"> apply -f k8s/jobs/prod-</w:t>
+      </w:r>
+      <w:proofErr w:type="spellStart"/>
+      <w:r>
+        <w:t>job.yaml</w:t>
+      </w:r>
+      <w:proofErr w:type="spellEnd"/>
+    </w:p>
+    <w:p/>
+    <w:p>
+      <w:pPr>
+        <w:rPr>
+          <w:b/>
+          <w:bCs/>
+        </w:rPr>
+      </w:pPr>
+      <w:r>
+        <w:rPr>
+          <w:b/>
+          <w:bCs/>
+        </w:rPr>
+        <w:t># Verify the Jobs</w:t>
+      </w:r>
+    </w:p>
+    <w:p>
       <w:proofErr w:type="spellStart"/>
       <w:r>
         <w:t>kubectl</w:t>
       </w:r>
       <w:proofErr w:type="spellEnd"/>
       <w:r>
-        <w:t xml:space="preserve"> </w:t>
-      </w:r>
-      <w:r>
-        <w:rPr>
-          <w:rStyle w:val="l"/>
-        </w:rPr>
-        <w:t>get</w:t>
-      </w:r>
-      <w:r>
-        <w:t xml:space="preserve"> deployments </w:t>
-      </w:r>
-      <w:r>
-        <w:rPr>
-          <w:rStyle w:val="n"/>
-        </w:rPr>
-        <w:t>-A</w:t>
-      </w:r>
-    </w:p>
-    <w:p>
-      <w:pPr>
-        <w:pStyle w:val="HTMLPreformatted"/>
-      </w:pPr>
-      <w:proofErr w:type="spellStart"/>
-      <w:r>
-        <w:rPr>
-          <w:rStyle w:val="HTMLCode"/>
-        </w:rPr>
+        <w:t xml:space="preserve"> get jobs -A</w:t>
+      </w:r>
+    </w:p>
+    <w:p/>
+    <w:p>
+      <w:pPr>
+        <w:rPr>
+          <w:b/>
+          <w:bCs/>
+        </w:rPr>
+      </w:pPr>
+      <w:r>
+        <w:rPr>
+          <w:b/>
+          <w:bCs/>
+        </w:rPr>
+        <w:t># Check the Pods created by the Jobs</w:t>
+      </w:r>
+    </w:p>
+    <w:p>
+      <w:proofErr w:type="spellStart"/>
+      <w:r>
         <w:t>kubectl</w:t>
       </w:r>
       <w:proofErr w:type="spellEnd"/>
       <w:r>
-        <w:rPr>
-          <w:rStyle w:val="HTMLCode"/>
-        </w:rPr>
-        <w:t xml:space="preserve"> </w:t>
-      </w:r>
-      <w:r>
-        <w:rPr>
-          <w:rStyle w:val="l"/>
-        </w:rPr>
-        <w:t>get</w:t>
-      </w:r>
-      <w:r>
-        <w:rPr>
-          <w:rStyle w:val="HTMLCode"/>
-        </w:rPr>
-        <w:t xml:space="preserve"> pods </w:t>
-      </w:r>
-      <w:r>
-        <w:rPr>
-          <w:rStyle w:val="n"/>
-        </w:rPr>
-        <w:t>-A</w:t>
-      </w:r>
-    </w:p>
-    <w:p/>
-    <w:p/>
-    <w:p>
-      <w:r>
-        <w:rPr>
-          <w:noProof/>
-        </w:rPr>
-        <w:lastRenderedPageBreak/>
-        <w:drawing>
-          <wp:inline distT="0" distB="0" distL="0" distR="0" wp14:anchorId="7E5A3FFB" wp14:editId="6755876E">
-            <wp:extent cx="5685013" cy="5128704"/>
-            <wp:effectExtent l="0" t="0" r="0" b="0"/>
-            <wp:docPr id="1735800550" name="Picture 1"/>
-            <wp:cNvGraphicFramePr>
-              <a:graphicFrameLocks xmlns:a="http://schemas.openxmlformats.org/drawingml/2006/main" noChangeAspect="1"/>
-            </wp:cNvGraphicFramePr>
-            <a:graphic xmlns:a="http://schemas.openxmlformats.org/drawingml/2006/main">
-              <a:graphicData uri="http://schemas.openxmlformats.org/drawingml/2006/picture">
-                <pic:pic xmlns:pic="http://schemas.openxmlformats.org/drawingml/2006/picture">
-                  <pic:nvPicPr>
-                    <pic:cNvPr id="1735800550" name=""/>
-                    <pic:cNvPicPr/>
-                  </pic:nvPicPr>
-                  <pic:blipFill>
-                    <a:blip r:embed="rId17"/>
-                    <a:stretch>
-                      <a:fillRect/>
-                    </a:stretch>
-                  </pic:blipFill>
-                  <pic:spPr>
-                    <a:xfrm>
-                      <a:off x="0" y="0"/>
-                      <a:ext cx="5685013" cy="5128704"/>
-                    </a:xfrm>
-                    <a:prstGeom prst="rect">
-                      <a:avLst/>
-                    </a:prstGeom>
-                  </pic:spPr>
-                </pic:pic>
-              </a:graphicData>
-            </a:graphic>
-          </wp:inline>
-        </w:drawing>
-      </w:r>
-    </w:p>
-    <w:p>
-      <w:r>
-        <w:rPr>
-          <w:noProof/>
-        </w:rPr>
-        <w:drawing>
-          <wp:inline distT="0" distB="0" distL="0" distR="0" wp14:anchorId="421CA35E" wp14:editId="4BFB8BD5">
-            <wp:extent cx="5943600" cy="2002155"/>
-            <wp:effectExtent l="0" t="0" r="0" b="0"/>
-            <wp:docPr id="421180609" name="Picture 1"/>
-            <wp:cNvGraphicFramePr>
-              <a:graphicFrameLocks xmlns:a="http://schemas.openxmlformats.org/drawingml/2006/main" noChangeAspect="1"/>
-            </wp:cNvGraphicFramePr>
-            <a:graphic xmlns:a="http://schemas.openxmlformats.org/drawingml/2006/main">
-              <a:graphicData uri="http://schemas.openxmlformats.org/drawingml/2006/picture">
-                <pic:pic xmlns:pic="http://schemas.openxmlformats.org/drawingml/2006/picture">
-                  <pic:nvPicPr>
-                    <pic:cNvPr id="421180609" name=""/>
-                    <pic:cNvPicPr/>
-                  </pic:nvPicPr>
-                  <pic:blipFill>
-                    <a:blip r:embed="rId18"/>
-                    <a:stretch>
-                      <a:fillRect/>
-                    </a:stretch>
-                  </pic:blipFill>
-                  <pic:spPr>
-                    <a:xfrm>
-                      <a:off x="0" y="0"/>
-                      <a:ext cx="5943600" cy="2002155"/>
-                    </a:xfrm>
-                    <a:prstGeom prst="rect">
-                      <a:avLst/>
-                    </a:prstGeom>
-                  </pic:spPr>
-                </pic:pic>
-              </a:graphicData>
-            </a:graphic>
-          </wp:inline>
-        </w:drawing>
-      </w:r>
-    </w:p>
-    <w:p/>
-    <w:p/>
-    <w:p/>
+        <w:t xml:space="preserve"> get pods -A</w:t>
+      </w:r>
+    </w:p>
+    <w:p/>
+    <w:p>
+      <w:pPr>
+        <w:rPr>
+          <w:b/>
+          <w:bCs/>
+        </w:rPr>
+      </w:pPr>
+      <w:r>
+        <w:rPr>
+          <w:b/>
+          <w:bCs/>
+        </w:rPr>
+        <w:t># View Job details</w:t>
+      </w:r>
+    </w:p>
+    <w:p>
+      <w:proofErr w:type="spellStart"/>
+      <w:r>
+        <w:t>kubectl</w:t>
+      </w:r>
+      <w:proofErr w:type="spellEnd"/>
+      <w:r>
+        <w:t xml:space="preserve"> describe job playwright-job -n dev</w:t>
+      </w:r>
+    </w:p>
+    <w:p>
+      <w:proofErr w:type="spellStart"/>
+      <w:r>
+        <w:t>kubectl</w:t>
+      </w:r>
+      <w:proofErr w:type="spellEnd"/>
+      <w:r>
+        <w:t xml:space="preserve"> describe job playwright-job -n staging</w:t>
+      </w:r>
+    </w:p>
+    <w:p>
+      <w:proofErr w:type="spellStart"/>
+      <w:r>
+        <w:t>kubectl</w:t>
+      </w:r>
+      <w:proofErr w:type="spellEnd"/>
+      <w:r>
+        <w:t xml:space="preserve"> describe job playwright-job -n prod</w:t>
+      </w:r>
+    </w:p>
+    <w:p/>
+    <w:p>
+      <w:pPr>
+        <w:rPr>
+          <w:b/>
+          <w:bCs/>
+        </w:rPr>
+      </w:pPr>
+      <w:r>
+        <w:rPr>
+          <w:b/>
+          <w:bCs/>
+        </w:rPr>
+        <w:t># View Job logs</w:t>
+      </w:r>
+    </w:p>
+    <w:p>
+      <w:proofErr w:type="spellStart"/>
+      <w:r>
+        <w:t>kubectl</w:t>
+      </w:r>
+      <w:proofErr w:type="spellEnd"/>
+      <w:r>
+        <w:t xml:space="preserve"> logs job/playwright-job -n dev</w:t>
+      </w:r>
+    </w:p>
+    <w:p>
+      <w:proofErr w:type="spellStart"/>
+      <w:r>
+        <w:t>kubectl</w:t>
+      </w:r>
+      <w:proofErr w:type="spellEnd"/>
+      <w:r>
+        <w:t xml:space="preserve"> logs job/playwright-job -n staging</w:t>
+      </w:r>
+    </w:p>
+    <w:p>
+      <w:proofErr w:type="spellStart"/>
+      <w:r>
+        <w:t>kubectl</w:t>
+      </w:r>
+      <w:proofErr w:type="spellEnd"/>
+      <w:r>
+        <w:t xml:space="preserve"> logs job/playwright-job -n prod</w:t>
+      </w:r>
+    </w:p>
+    <w:p/>
+    <w:p>
+      <w:pPr>
+        <w:jc w:val="center"/>
+      </w:pPr>
+    </w:p>
+    <w:p>
+      <w:pPr>
+        <w:jc w:val="center"/>
+      </w:pPr>
+    </w:p>
+    <w:p>
+      <w:pPr>
+        <w:jc w:val="center"/>
+      </w:pPr>
+    </w:p>
+    <w:p>
+      <w:pPr>
+        <w:jc w:val="center"/>
+      </w:pPr>
+    </w:p>
+    <w:p>
+      <w:pPr>
+        <w:jc w:val="center"/>
+      </w:pPr>
+    </w:p>
+    <w:p>
+      <w:pPr>
+        <w:jc w:val="center"/>
+      </w:pPr>
+    </w:p>
     <w:p>
       <w:pPr>
         <w:jc w:val="center"/>
@@ -3931,10 +4330,12 @@
         <w:t xml:space="preserve">    </w:t>
       </w:r>
       <w:proofErr w:type="spellStart"/>
+      <w:proofErr w:type="gramStart"/>
       <w:r>
         <w:t>requests.memory</w:t>
       </w:r>
       <w:proofErr w:type="spellEnd"/>
+      <w:proofErr w:type="gramEnd"/>
       <w:r>
         <w:t>: 1Gi</w:t>
       </w:r>
@@ -3957,10 +4358,12 @@
         <w:t xml:space="preserve">    </w:t>
       </w:r>
       <w:proofErr w:type="spellStart"/>
+      <w:proofErr w:type="gramStart"/>
       <w:r>
         <w:t>limits.memory</w:t>
       </w:r>
       <w:proofErr w:type="spellEnd"/>
+      <w:proofErr w:type="gramEnd"/>
       <w:r>
         <w:t>: 2Gi</w:t>
       </w:r>
@@ -4087,10 +4490,12 @@
         <w:t xml:space="preserve">    </w:t>
       </w:r>
       <w:proofErr w:type="spellStart"/>
+      <w:proofErr w:type="gramStart"/>
       <w:r>
         <w:t>requests.memory</w:t>
       </w:r>
       <w:proofErr w:type="spellEnd"/>
+      <w:proofErr w:type="gramEnd"/>
       <w:r>
         <w:t>: 2Gi</w:t>
       </w:r>
@@ -4113,10 +4518,12 @@
         <w:t xml:space="preserve">    </w:t>
       </w:r>
       <w:proofErr w:type="spellStart"/>
+      <w:proofErr w:type="gramStart"/>
       <w:r>
         <w:t>limits.memory</w:t>
       </w:r>
       <w:proofErr w:type="spellEnd"/>
+      <w:proofErr w:type="gramEnd"/>
       <w:r>
         <w:t>: 4Gi</w:t>
       </w:r>
@@ -4239,10 +4646,12 @@
         <w:t xml:space="preserve">    </w:t>
       </w:r>
       <w:proofErr w:type="spellStart"/>
+      <w:proofErr w:type="gramStart"/>
       <w:r>
         <w:t>requests.memory</w:t>
       </w:r>
       <w:proofErr w:type="spellEnd"/>
+      <w:proofErr w:type="gramEnd"/>
       <w:r>
         <w:t>: 4Gi</w:t>
       </w:r>
@@ -4265,10 +4674,12 @@
         <w:t xml:space="preserve">    </w:t>
       </w:r>
       <w:proofErr w:type="spellStart"/>
+      <w:proofErr w:type="gramStart"/>
       <w:r>
         <w:t>limits.memory</w:t>
       </w:r>
       <w:proofErr w:type="spellEnd"/>
+      <w:proofErr w:type="gramEnd"/>
       <w:r>
         <w:t>: 8Gi</w:t>
       </w:r>
@@ -4810,14 +5221,20 @@
         <w:t>dev</w:t>
       </w:r>
     </w:p>
+    <w:p/>
     <w:p>
       <w:r>
         <w:t>cat &lt;&lt;EOF &gt; k8s/scripts/deploy-dev.sh</w:t>
       </w:r>
     </w:p>
     <w:p>
-      <w:r>
-        <w:t>#!/bin/bash</w:t>
+      <w:proofErr w:type="gramStart"/>
+      <w:r>
+        <w:t>#!/</w:t>
+      </w:r>
+      <w:proofErr w:type="gramEnd"/>
+      <w:r>
+        <w:t>bin/bash</w:t>
       </w:r>
     </w:p>
     <w:p/>
@@ -4920,11 +5337,11 @@
       </w:r>
       <w:proofErr w:type="spellEnd"/>
       <w:r>
-        <w:t xml:space="preserve"> apply -f deployments/dev-</w:t>
-      </w:r>
-      <w:proofErr w:type="spellStart"/>
-      <w:r>
-        <w:t>deployment.yaml</w:t>
+        <w:t xml:space="preserve"> apply -f jobs/dev-</w:t>
+      </w:r>
+      <w:proofErr w:type="spellStart"/>
+      <w:r>
+        <w:t>job.yaml</w:t>
       </w:r>
       <w:proofErr w:type="spellEnd"/>
     </w:p>
@@ -4946,7 +5363,17 @@
       </w:r>
       <w:proofErr w:type="spellEnd"/>
       <w:r>
-        <w:t xml:space="preserve"> get all -n dev</w:t>
+        <w:t xml:space="preserve"> get jobs -n dev</w:t>
+      </w:r>
+    </w:p>
+    <w:p>
+      <w:proofErr w:type="spellStart"/>
+      <w:r>
+        <w:t>kubectl</w:t>
+      </w:r>
+      <w:proofErr w:type="spellEnd"/>
+      <w:r>
+        <w:t xml:space="preserve"> get pods -n dev</w:t>
       </w:r>
     </w:p>
     <w:p/>
@@ -4965,7 +5392,6 @@
         <w:t>EOF</w:t>
       </w:r>
     </w:p>
-    <w:p/>
     <w:p/>
     <w:p/>
     <w:p/>
@@ -4988,20 +5414,23 @@
           <w:sz w:val="28"/>
           <w:szCs w:val="28"/>
         </w:rPr>
-        <w:lastRenderedPageBreak/>
         <w:t>staging</w:t>
       </w:r>
     </w:p>
     <w:p/>
-    <w:p/>
     <w:p>
       <w:r>
         <w:t>cat &lt;&lt;EOF &gt; k8s/scripts/deploy-staging.sh</w:t>
       </w:r>
     </w:p>
     <w:p>
-      <w:r>
-        <w:t>#!/bin/bash</w:t>
+      <w:proofErr w:type="gramStart"/>
+      <w:r>
+        <w:t>#!/</w:t>
+      </w:r>
+      <w:proofErr w:type="gramEnd"/>
+      <w:r>
+        <w:t>bin/bash</w:t>
       </w:r>
     </w:p>
     <w:p/>
@@ -5104,11 +5533,11 @@
       </w:r>
       <w:proofErr w:type="spellEnd"/>
       <w:r>
-        <w:t xml:space="preserve"> apply -f deployments/staging-</w:t>
-      </w:r>
-      <w:proofErr w:type="spellStart"/>
-      <w:r>
-        <w:t>deployment.yaml</w:t>
+        <w:t xml:space="preserve"> apply -f jobs/staging-</w:t>
+      </w:r>
+      <w:proofErr w:type="spellStart"/>
+      <w:r>
+        <w:t>job.yaml</w:t>
       </w:r>
       <w:proofErr w:type="spellEnd"/>
     </w:p>
@@ -5130,7 +5559,17 @@
       </w:r>
       <w:proofErr w:type="spellEnd"/>
       <w:r>
-        <w:t xml:space="preserve"> get all -n staging</w:t>
+        <w:t xml:space="preserve"> get jobs -n staging</w:t>
+      </w:r>
+    </w:p>
+    <w:p>
+      <w:proofErr w:type="spellStart"/>
+      <w:r>
+        <w:t>kubectl</w:t>
+      </w:r>
+      <w:proofErr w:type="spellEnd"/>
+      <w:r>
+        <w:t xml:space="preserve"> get pods -n staging</w:t>
       </w:r>
     </w:p>
     <w:p/>
@@ -5149,7 +5588,6 @@
         <w:t>EOF</w:t>
       </w:r>
     </w:p>
-    <w:p/>
     <w:p/>
     <w:p/>
     <w:p/>
@@ -5184,8 +5622,13 @@
       </w:r>
     </w:p>
     <w:p>
-      <w:r>
-        <w:t>#!/bin/bash</w:t>
+      <w:proofErr w:type="gramStart"/>
+      <w:r>
+        <w:t>#!/</w:t>
+      </w:r>
+      <w:proofErr w:type="gramEnd"/>
+      <w:r>
+        <w:t>bin/bash</w:t>
       </w:r>
     </w:p>
     <w:p/>
@@ -5288,11 +5731,11 @@
       </w:r>
       <w:proofErr w:type="spellEnd"/>
       <w:r>
-        <w:t xml:space="preserve"> apply -f deployments/prod-</w:t>
-      </w:r>
-      <w:proofErr w:type="spellStart"/>
-      <w:r>
-        <w:t>deployment.yaml</w:t>
+        <w:t xml:space="preserve"> apply -f jobs/prod-</w:t>
+      </w:r>
+      <w:proofErr w:type="spellStart"/>
+      <w:r>
+        <w:t>job.yaml</w:t>
       </w:r>
       <w:proofErr w:type="spellEnd"/>
     </w:p>
@@ -5314,7 +5757,17 @@
       </w:r>
       <w:proofErr w:type="spellEnd"/>
       <w:r>
-        <w:t xml:space="preserve"> get all -n prod</w:t>
+        <w:t xml:space="preserve"> get jobs -n prod</w:t>
+      </w:r>
+    </w:p>
+    <w:p>
+      <w:proofErr w:type="spellStart"/>
+      <w:r>
+        <w:t>kubectl</w:t>
+      </w:r>
+      <w:proofErr w:type="spellEnd"/>
+      <w:r>
+        <w:t xml:space="preserve"> get pods -n prod</w:t>
       </w:r>
     </w:p>
     <w:p/>
@@ -5333,8 +5786,6 @@
         <w:t>EOF</w:t>
       </w:r>
     </w:p>
-    <w:p/>
-    <w:p/>
     <w:p/>
     <w:p/>
     <w:p/>
@@ -5361,7 +5812,7 @@
           <w:sz w:val="28"/>
           <w:szCs w:val="28"/>
         </w:rPr>
-        <w:t>Cleanup</w:t>
+        <w:t>cleanup.sh</w:t>
       </w:r>
     </w:p>
     <w:p>
@@ -5370,8 +5821,13 @@
       </w:r>
     </w:p>
     <w:p>
-      <w:r>
-        <w:t>#!/bin/bash</w:t>
+      <w:proofErr w:type="gramStart"/>
+      <w:r>
+        <w:t>#!/</w:t>
+      </w:r>
+      <w:proofErr w:type="gramEnd"/>
+      <w:r>
+        <w:t>bin/bash</w:t>
       </w:r>
     </w:p>
     <w:p/>
@@ -5437,7 +5893,18 @@
         <w:t>EOF</w:t>
       </w:r>
     </w:p>
-    <w:p/>
+    <w:p>
+      <w:pPr>
+        <w:jc w:val="center"/>
+        <w:rPr>
+          <w:b/>
+          <w:bCs/>
+          <w:color w:val="C00000"/>
+          <w:sz w:val="28"/>
+          <w:szCs w:val="28"/>
+        </w:rPr>
+      </w:pPr>
+    </w:p>
     <w:p>
       <w:pPr>
         <w:jc w:val="center"/>

</xml_diff>